<commit_message>
Resume Update for DOCX and PDF
</commit_message>
<xml_diff>
--- a/assets/docx-files/EvanKingResume.docx
+++ b/assets/docx-files/EvanKingResume.docx
@@ -587,7 +587,7 @@
           <w:sz w:val="22"/>
           <w:szCs w:val="22"/>
         </w:rPr>
-        <w:t>Provalus - Corckett, TX - November 2025 - Present</w:t>
+        <w:t>proValus - Corckett, TX - November 2025 - Present</w:t>
       </w:r>
     </w:p>
     <w:p>
@@ -650,7 +650,7 @@
           <w:sz w:val="22"/>
           <w:szCs w:val="22"/>
         </w:rPr>
-        <w:t>Handling and resolving customer complaints regarding product sales to customer service problems.</w:t>
+        <w:t>Serve as the first point of contact for end users experiencing technical issues via phone, email, chat, or ticketing system.</w:t>
       </w:r>
     </w:p>
     <w:p>
@@ -682,7 +682,7 @@
           <w:sz w:val="22"/>
           <w:szCs w:val="22"/>
         </w:rPr>
-        <w:t>Obtaining and evaluating all relevant data to handle complaints and inquiries..</w:t>
+        <w:t>Diagnose and resolve hardware, software, and connectivity issues across desktops, laptops, printers, mobile devices, and remote access tools (e.g., VPN).</w:t>
       </w:r>
     </w:p>
     <w:p>
@@ -714,7 +714,7 @@
           <w:sz w:val="22"/>
           <w:szCs w:val="22"/>
         </w:rPr>
-        <w:t>Managing administration, communicating and coordinating with internal departments.</w:t>
+        <w:t>Perform password resets, account unlocks, and basic user account provisioning and de-provisioning.</w:t>
       </w:r>
     </w:p>
     <w:p>
@@ -746,7 +746,7 @@
           <w:sz w:val="22"/>
           <w:szCs w:val="22"/>
         </w:rPr>
-        <w:t>Researching required information using available resources.</w:t>
+        <w:t>Install, configure, and update software and applications according to standard procedures.</w:t>
       </w:r>
     </w:p>
     <w:p>
@@ -778,7 +778,7 @@
           <w:sz w:val="22"/>
           <w:szCs w:val="22"/>
         </w:rPr>
-        <w:t>Managing customer records, recording call details, inquiries, complaints, actions taken and updating the CRM.</w:t>
+        <w:t>Log, track, and update tickets accurately and thoroughly in the ITSM/ticketing system, following each issue through to resolution.</w:t>
       </w:r>
     </w:p>
     <w:p>
@@ -810,6 +810,38 @@
           <w:sz w:val="22"/>
           <w:szCs w:val="22"/>
         </w:rPr>
+        <w:t>Managing customer records, recording call details, inquiries, complaints, actions taken and updating the CRM.</w:t>
+      </w:r>
+    </w:p>
+    <w:p>
+      <w:pPr>
+        <w:numPr>
+          <w:ilvl w:val="0"/>
+          <w:numId w:val="4"/>
+        </w:numPr>
+        <w:ind w:left="360" w:hanging="360"/>
+        <w:keepNext/>
+        <w:keepLines/>
+        <w:pBdr>
+          <w:top w:val="nil" w:sz="0" w:space="0" w:color="000000" tmln="20, 20, 20, 0, 0"/>
+          <w:left w:val="nil" w:sz="0" w:space="0" w:color="000000" tmln="20, 20, 20, 0, 0"/>
+          <w:bottom w:val="nil" w:sz="0" w:space="0" w:color="000000" tmln="20, 20, 20, 0, 0"/>
+          <w:right w:val="nil" w:sz="0" w:space="0" w:color="000000" tmln="20, 20, 20, 0, 0"/>
+          <w:between w:val="nil" w:sz="0" w:space="0" w:color="000000" tmln="20, 20, 20, 0, 0"/>
+        </w:pBdr>
+        <w:shd w:val="none"/>
+        <w:rPr>
+          <w:rFonts w:ascii="Arial" w:hAnsi="Arial" w:eastAsia="Arial" w:cs="Arial"/>
+          <w:sz w:val="22"/>
+          <w:szCs w:val="22"/>
+        </w:rPr>
+      </w:pPr>
+      <w:r>
+        <w:rPr>
+          <w:rFonts w:ascii="Arial" w:hAnsi="Arial" w:eastAsia="Arial" w:cs="Arial"/>
+          <w:sz w:val="22"/>
+          <w:szCs w:val="22"/>
+        </w:rPr>
         <w:t>Following up complicated customer calls where required.</w:t>
       </w:r>
     </w:p>
@@ -1083,6 +1115,9 @@
       </w:r>
     </w:p>
     <w:p>
+      <w:r/>
+    </w:p>
+    <w:p>
       <w:pPr>
         <w:keepNext/>
         <w:keepLines/>
@@ -1101,6 +1136,9 @@
           <w:szCs w:val="22"/>
         </w:rPr>
       </w:pPr>
+      <w:r>
+        <w:br w:type="page"/>
+      </w:r>
       <w:r>
         <w:rPr>
           <w:rFonts w:ascii="Arial" w:hAnsi="Arial" w:eastAsia="Arial" w:cs="Arial"/>
@@ -1978,13 +2016,11 @@
     <w:name w:val="Bullet 4"/>
     <w:lvl w:ilvl="0">
       <w:numFmt w:val="bullet"/>
+      <w:suff w:val="tab"/>
       <w:lvlText w:val=""/>
       <w:lvlJc w:val="left"/>
       <w:pPr>
-        <w:tabs>
-          <w:tab w:val="num" w:pos="360"/>
-        </w:tabs>
-        <w:ind w:left="360" w:hanging="360"/>
+        <w:ind w:left="0" w:hanging="0"/>
       </w:pPr>
       <w:rPr>
         <w:rFonts w:ascii="Wingdings" w:hAnsi="Wingdings" w:eastAsia="Wingdings" w:cs="Wingdings"/>

</xml_diff>